<commit_message>
Merge-follow-up: model folders from master re-rendered on the changed shared model (engines regenerated for the measured footnote clearance and unsplit notes; an optional block with an empty field prints nothing; the docx page lookup searches a heading past the one before it only) (fb-595.54.13)
</commit_message>
<xml_diff>
--- a/courts/eighth-circuit/missouri/state/court-of-appeals-southern-district/opening-brief/usage/OUTPUT-opening-brief.docx
+++ b/courts/eighth-circuit/missouri/state/court-of-appeals-southern-district/opening-brief/usage/OUTPUT-opening-brief.docx
@@ -7896,7 +7896,7 @@
         <w:pStyle w:val="XdQuoteOnly"/>
       </w:pPr>
       <w:r>
-        <w:t xml:space="preserve">We conclude that the incident of August 12, 2011, was (1) unexpected, (2) traumatic, (3) identifiable by time and place of occurrence, and (4) produced at the time objective symptoms of an injury caused by a specific event during a single work shift -namely, employee’s difficulty breathing and his spitting up blood. We conclude, therefore, that employee suffered an accident.</w:t>
+        <w:t xml:space="preserve">We conclude that the incident of August 12, 2011, was (1) unexpected, (2) traumatic, (3) identifiable by time and place of occurrence, and (4) produced at the time objective symptoms of an injury caused by a specific event during a single work shift -​namely, employee’s difficulty breathing and his spitting up blood. We conclude, therefore, that employee suffered an accident.</w:t>
       </w:r>
     </w:p>
     <w:p>
@@ -8947,7 +8947,7 @@
         <w:t xml:space="preserve"> </w:t>
       </w:r>
       <w:r>
-        <w:t xml:space="preserve">A person with a pulmonary contusion has a bruise to the lung, which results in bleeding into the lung tissue. The collection of blood can prevent oxygen from passing from the lung, into the bloodstream. http://www.freemd.com/​pulmonary-contusion/​overview.htm</w:t>
+        <w:t xml:space="preserve">A person with a pulmonary contusion has a bruise to the lung, which results in bleeding into the lung tissue. The collection of blood can prevent oxygen from passing from the lung, into the bloodstream. http://​​www.​freemd.​com/​​pulmonary-​contusion/​​overview.​htm</w:t>
       </w:r>
     </w:p>
   </w:footnote>
@@ -8966,7 +8966,7 @@
         <w:t xml:space="preserve"> </w:t>
       </w:r>
       <w:r>
-        <w:t xml:space="preserve">A hypertensive crisis is a severe increase in blood pressure that can lead to a stroke. As a result, the heart may not be able to pump blood effectively. http://www.mayoclinic.org/​diseases-conditions/​high-blood-pressure/​expert-answers/​hypertensive-crisis/​faq</w:t>
+        <w:t xml:space="preserve">A hypertensive crisis is a severe increase in blood pressure that can lead to a stroke. As a result, the heart may not be able to pump blood effectively. http://​​www.​mayoclinic.​org/​​diseases-​conditions/​​high-​blood-​pressure/​​expert-​answers/​​hypertensive-​crisis/​​faq</w:t>
       </w:r>
       <w:r>
         <w:noBreakHyphen/>
@@ -9733,6 +9733,7 @@
     <w:unhideWhenUsed/>
     <w:qFormat/>
     <w:pPr>
+      <w:keepLines/>
       <w:spacing w:before="0" w:after="140" w:line="299" w:lineRule="exact"/>
     </w:pPr>
     <w:rPr>

</xml_diff>